<commit_message>
Report: continuous page numbers from 1, English digits, clear black page numbers
Co-Authored-By: Claude Opus 5.5 <noreply@anthropic.com>
Claude-Session: https://claude.ai/code/session_01RVHqZkty1Aftyae7eJBKDt
</commit_message>
<xml_diff>
--- a/docs/report/graduation-report-final.docx
+++ b/docs/report/graduation-report-final.docx
@@ -1214,7 +1214,7 @@
             <w:rFonts w:ascii="Calibri" w:hAnsi="Calibri" w:cs="Calibri"/>
             <w:noProof/>
           </w:rPr>
-          <w:t xml:space="preserve">ii</w:t>
+          <w:t xml:space="preserve">2</w:t>
         </w:r>
         <w:r>
           <w:rPr>
@@ -1273,7 +1273,7 @@
             <w:rFonts w:ascii="Calibri" w:hAnsi="Calibri" w:cs="Calibri"/>
             <w:noProof/>
           </w:rPr>
-          <w:t xml:space="preserve">iii</w:t>
+          <w:t xml:space="preserve">3</w:t>
         </w:r>
         <w:r>
           <w:rPr>
@@ -1332,7 +1332,7 @@
             <w:rFonts w:ascii="Calibri" w:hAnsi="Calibri" w:cs="Calibri"/>
             <w:noProof/>
           </w:rPr>
-          <w:t xml:space="preserve">iv</w:t>
+          <w:t xml:space="preserve">4</w:t>
         </w:r>
         <w:r>
           <w:rPr>
@@ -1391,7 +1391,7 @@
             <w:rFonts w:ascii="Calibri" w:hAnsi="Calibri" w:cs="Calibri"/>
             <w:noProof/>
           </w:rPr>
-          <w:t xml:space="preserve">v</w:t>
+          <w:t xml:space="preserve">5</w:t>
         </w:r>
         <w:r>
           <w:rPr>
@@ -1450,7 +1450,7 @@
             <w:rFonts w:ascii="Calibri" w:hAnsi="Calibri" w:cs="Calibri"/>
             <w:noProof/>
           </w:rPr>
-          <w:t xml:space="preserve">vii</w:t>
+          <w:t xml:space="preserve">7</w:t>
         </w:r>
         <w:r>
           <w:rPr>
@@ -1509,7 +1509,7 @@
             <w:rFonts w:ascii="Calibri" w:hAnsi="Calibri" w:cs="Calibri"/>
             <w:noProof/>
           </w:rPr>
-          <w:t xml:space="preserve">viii</w:t>
+          <w:t xml:space="preserve">8</w:t>
         </w:r>
         <w:r>
           <w:rPr>
@@ -1568,7 +1568,7 @@
             <w:rFonts w:ascii="Calibri" w:hAnsi="Calibri" w:cs="Calibri"/>
             <w:noProof/>
           </w:rPr>
-          <w:t xml:space="preserve">1</w:t>
+          <w:t xml:space="preserve">9</w:t>
         </w:r>
         <w:r>
           <w:rPr>
@@ -1631,7 +1631,7 @@
             <w:sz w:val="22"/>
             <w:szCs w:val="22"/>
           </w:rPr>
-          <w:t xml:space="preserve">1</w:t>
+          <w:t xml:space="preserve">9</w:t>
         </w:r>
         <w:r>
           <w:rPr>
@@ -1694,7 +1694,7 @@
             <w:sz w:val="22"/>
             <w:szCs w:val="22"/>
           </w:rPr>
-          <w:t xml:space="preserve">2</w:t>
+          <w:t xml:space="preserve">10</w:t>
         </w:r>
         <w:r>
           <w:rPr>
@@ -1753,7 +1753,7 @@
             <w:rFonts w:ascii="Calibri" w:hAnsi="Calibri" w:cs="Calibri"/>
             <w:noProof/>
           </w:rPr>
-          <w:t xml:space="preserve">2</w:t>
+          <w:t xml:space="preserve">10</w:t>
         </w:r>
         <w:r>
           <w:rPr>
@@ -1812,7 +1812,7 @@
             <w:rFonts w:ascii="Calibri" w:hAnsi="Calibri" w:cs="Calibri"/>
             <w:noProof/>
           </w:rPr>
-          <w:t xml:space="preserve">2</w:t>
+          <w:t xml:space="preserve">10</w:t>
         </w:r>
         <w:r>
           <w:rPr>
@@ -1871,7 +1871,7 @@
             <w:rFonts w:ascii="Calibri" w:hAnsi="Calibri" w:cs="Calibri"/>
             <w:noProof/>
           </w:rPr>
-          <w:t xml:space="preserve">2</w:t>
+          <w:t xml:space="preserve">10</w:t>
         </w:r>
         <w:r>
           <w:rPr>
@@ -1934,7 +1934,7 @@
             <w:sz w:val="22"/>
             <w:szCs w:val="22"/>
           </w:rPr>
-          <w:t xml:space="preserve">2</w:t>
+          <w:t xml:space="preserve">10</w:t>
         </w:r>
         <w:r>
           <w:rPr>
@@ -1993,7 +1993,7 @@
             <w:rFonts w:ascii="Calibri" w:hAnsi="Calibri" w:cs="Calibri"/>
             <w:noProof/>
           </w:rPr>
-          <w:t xml:space="preserve">3</w:t>
+          <w:t xml:space="preserve">11</w:t>
         </w:r>
         <w:r>
           <w:rPr>
@@ -2052,7 +2052,7 @@
             <w:rFonts w:ascii="Calibri" w:hAnsi="Calibri" w:cs="Calibri"/>
             <w:noProof/>
           </w:rPr>
-          <w:t xml:space="preserve">4</w:t>
+          <w:t xml:space="preserve">12</w:t>
         </w:r>
         <w:r>
           <w:rPr>
@@ -2111,7 +2111,7 @@
             <w:rFonts w:ascii="Calibri" w:hAnsi="Calibri" w:cs="Calibri"/>
             <w:noProof/>
           </w:rPr>
-          <w:t xml:space="preserve">4</w:t>
+          <w:t xml:space="preserve">12</w:t>
         </w:r>
         <w:r>
           <w:rPr>
@@ -2170,7 +2170,7 @@
             <w:rFonts w:ascii="Calibri" w:hAnsi="Calibri" w:cs="Calibri"/>
             <w:noProof/>
           </w:rPr>
-          <w:t xml:space="preserve">4</w:t>
+          <w:t xml:space="preserve">12</w:t>
         </w:r>
         <w:r>
           <w:rPr>
@@ -2229,7 +2229,7 @@
             <w:rFonts w:ascii="Calibri" w:hAnsi="Calibri" w:cs="Calibri"/>
             <w:noProof/>
           </w:rPr>
-          <w:t xml:space="preserve">5</w:t>
+          <w:t xml:space="preserve">13</w:t>
         </w:r>
         <w:r>
           <w:rPr>
@@ -2288,7 +2288,7 @@
             <w:rFonts w:ascii="Calibri" w:hAnsi="Calibri" w:cs="Calibri"/>
             <w:noProof/>
           </w:rPr>
-          <w:t xml:space="preserve">6</w:t>
+          <w:t xml:space="preserve">14</w:t>
         </w:r>
         <w:r>
           <w:rPr>
@@ -2347,7 +2347,7 @@
             <w:rFonts w:ascii="Calibri" w:hAnsi="Calibri" w:cs="Calibri"/>
             <w:noProof/>
           </w:rPr>
-          <w:t xml:space="preserve">7</w:t>
+          <w:t xml:space="preserve">15</w:t>
         </w:r>
         <w:r>
           <w:rPr>
@@ -2410,7 +2410,7 @@
             <w:sz w:val="22"/>
             <w:szCs w:val="22"/>
           </w:rPr>
-          <w:t xml:space="preserve">7</w:t>
+          <w:t xml:space="preserve">15</w:t>
         </w:r>
         <w:r>
           <w:rPr>
@@ -2469,7 +2469,7 @@
             <w:rFonts w:ascii="Calibri" w:hAnsi="Calibri" w:cs="Calibri"/>
             <w:noProof/>
           </w:rPr>
-          <w:t xml:space="preserve">7</w:t>
+          <w:t xml:space="preserve">15</w:t>
         </w:r>
         <w:r>
           <w:rPr>
@@ -2528,7 +2528,7 @@
             <w:rFonts w:ascii="Calibri" w:hAnsi="Calibri" w:cs="Calibri"/>
             <w:noProof/>
           </w:rPr>
-          <w:t xml:space="preserve">8</w:t>
+          <w:t xml:space="preserve">16</w:t>
         </w:r>
         <w:r>
           <w:rPr>
@@ -2587,7 +2587,7 @@
             <w:rFonts w:ascii="Calibri" w:hAnsi="Calibri" w:cs="Calibri"/>
             <w:noProof/>
           </w:rPr>
-          <w:t xml:space="preserve">9</w:t>
+          <w:t xml:space="preserve">17</w:t>
         </w:r>
         <w:r>
           <w:rPr>
@@ -2646,7 +2646,7 @@
             <w:rFonts w:ascii="Calibri" w:hAnsi="Calibri" w:cs="Calibri"/>
             <w:noProof/>
           </w:rPr>
-          <w:t xml:space="preserve">10</w:t>
+          <w:t xml:space="preserve">18</w:t>
         </w:r>
         <w:r>
           <w:rPr>
@@ -2705,7 +2705,7 @@
             <w:rFonts w:ascii="Calibri" w:hAnsi="Calibri" w:cs="Calibri"/>
             <w:noProof/>
           </w:rPr>
-          <w:t xml:space="preserve">10</w:t>
+          <w:t xml:space="preserve">18</w:t>
         </w:r>
         <w:r>
           <w:rPr>
@@ -2764,7 +2764,7 @@
             <w:rFonts w:ascii="Calibri" w:hAnsi="Calibri" w:cs="Calibri"/>
             <w:noProof/>
           </w:rPr>
-          <w:t xml:space="preserve">11</w:t>
+          <w:t xml:space="preserve">19</w:t>
         </w:r>
         <w:r>
           <w:rPr>
@@ -2823,7 +2823,7 @@
             <w:rFonts w:ascii="Calibri" w:hAnsi="Calibri" w:cs="Calibri"/>
             <w:noProof/>
           </w:rPr>
-          <w:t xml:space="preserve">12</w:t>
+          <w:t xml:space="preserve">20</w:t>
         </w:r>
         <w:r>
           <w:rPr>
@@ -2886,7 +2886,7 @@
             <w:sz w:val="22"/>
             <w:szCs w:val="22"/>
           </w:rPr>
-          <w:t xml:space="preserve">12</w:t>
+          <w:t xml:space="preserve">20</w:t>
         </w:r>
         <w:r>
           <w:rPr>
@@ -2945,7 +2945,7 @@
             <w:rFonts w:ascii="Calibri" w:hAnsi="Calibri" w:cs="Calibri"/>
             <w:noProof/>
           </w:rPr>
-          <w:t xml:space="preserve">12</w:t>
+          <w:t xml:space="preserve">20</w:t>
         </w:r>
         <w:r>
           <w:rPr>
@@ -3004,7 +3004,7 @@
             <w:rFonts w:ascii="Calibri" w:hAnsi="Calibri" w:cs="Calibri"/>
             <w:noProof/>
           </w:rPr>
-          <w:t xml:space="preserve">13</w:t>
+          <w:t xml:space="preserve">21</w:t>
         </w:r>
         <w:r>
           <w:rPr>
@@ -3063,7 +3063,7 @@
             <w:rFonts w:ascii="Calibri" w:hAnsi="Calibri" w:cs="Calibri"/>
             <w:noProof/>
           </w:rPr>
-          <w:t xml:space="preserve">14</w:t>
+          <w:t xml:space="preserve">22</w:t>
         </w:r>
         <w:r>
           <w:rPr>
@@ -3122,7 +3122,7 @@
             <w:rFonts w:ascii="Calibri" w:hAnsi="Calibri" w:cs="Calibri"/>
             <w:noProof/>
           </w:rPr>
-          <w:t xml:space="preserve">15</w:t>
+          <w:t xml:space="preserve">23</w:t>
         </w:r>
         <w:r>
           <w:rPr>
@@ -3181,7 +3181,7 @@
             <w:rFonts w:ascii="Calibri" w:hAnsi="Calibri" w:cs="Calibri"/>
             <w:noProof/>
           </w:rPr>
-          <w:t xml:space="preserve">16</w:t>
+          <w:t xml:space="preserve">24</w:t>
         </w:r>
         <w:r>
           <w:rPr>
@@ -3240,7 +3240,7 @@
             <w:rFonts w:ascii="Calibri" w:hAnsi="Calibri" w:cs="Calibri"/>
             <w:noProof/>
           </w:rPr>
-          <w:t xml:space="preserve">17</w:t>
+          <w:t xml:space="preserve">25</w:t>
         </w:r>
         <w:r>
           <w:rPr>
@@ -3299,7 +3299,7 @@
             <w:rFonts w:ascii="Calibri" w:hAnsi="Calibri" w:cs="Calibri"/>
             <w:noProof/>
           </w:rPr>
-          <w:t xml:space="preserve">18</w:t>
+          <w:t xml:space="preserve">26</w:t>
         </w:r>
         <w:r>
           <w:rPr>
@@ -3362,7 +3362,7 @@
             <w:sz w:val="22"/>
             <w:szCs w:val="22"/>
           </w:rPr>
-          <w:t xml:space="preserve">18</w:t>
+          <w:t xml:space="preserve">26</w:t>
         </w:r>
         <w:r>
           <w:rPr>
@@ -3421,7 +3421,7 @@
             <w:rFonts w:ascii="Calibri" w:hAnsi="Calibri" w:cs="Calibri"/>
             <w:noProof/>
           </w:rPr>
-          <w:t xml:space="preserve">18</w:t>
+          <w:t xml:space="preserve">26</w:t>
         </w:r>
         <w:r>
           <w:rPr>
@@ -3480,7 +3480,7 @@
             <w:rFonts w:ascii="Calibri" w:hAnsi="Calibri" w:cs="Calibri"/>
             <w:noProof/>
           </w:rPr>
-          <w:t xml:space="preserve">20</w:t>
+          <w:t xml:space="preserve">28</w:t>
         </w:r>
         <w:r>
           <w:rPr>
@@ -3539,7 +3539,7 @@
             <w:rFonts w:ascii="Calibri" w:hAnsi="Calibri" w:cs="Calibri"/>
             <w:noProof/>
           </w:rPr>
-          <w:t xml:space="preserve">21</w:t>
+          <w:t xml:space="preserve">29</w:t>
         </w:r>
         <w:r>
           <w:rPr>
@@ -3598,7 +3598,7 @@
             <w:rFonts w:ascii="Calibri" w:hAnsi="Calibri" w:cs="Calibri"/>
             <w:noProof/>
           </w:rPr>
-          <w:t xml:space="preserve">22</w:t>
+          <w:t xml:space="preserve">30</w:t>
         </w:r>
         <w:r>
           <w:rPr>
@@ -3657,7 +3657,7 @@
             <w:rFonts w:ascii="Calibri" w:hAnsi="Calibri" w:cs="Calibri"/>
             <w:noProof/>
           </w:rPr>
-          <w:t xml:space="preserve">23</w:t>
+          <w:t xml:space="preserve">31</w:t>
         </w:r>
         <w:r>
           <w:rPr>
@@ -3720,7 +3720,7 @@
             <w:sz w:val="22"/>
             <w:szCs w:val="22"/>
           </w:rPr>
-          <w:t xml:space="preserve">23</w:t>
+          <w:t xml:space="preserve">31</w:t>
         </w:r>
         <w:r>
           <w:rPr>
@@ -3779,7 +3779,7 @@
             <w:rFonts w:ascii="Calibri" w:hAnsi="Calibri" w:cs="Calibri"/>
             <w:noProof/>
           </w:rPr>
-          <w:t xml:space="preserve">24</w:t>
+          <w:t xml:space="preserve">32</w:t>
         </w:r>
         <w:r>
           <w:rPr>
@@ -3838,7 +3838,7 @@
             <w:rFonts w:ascii="Calibri" w:hAnsi="Calibri" w:cs="Calibri"/>
             <w:noProof/>
           </w:rPr>
-          <w:t xml:space="preserve">24</w:t>
+          <w:t xml:space="preserve">32</w:t>
         </w:r>
         <w:r>
           <w:rPr>
@@ -3897,7 +3897,7 @@
             <w:rFonts w:ascii="Calibri" w:hAnsi="Calibri" w:cs="Calibri"/>
             <w:noProof/>
           </w:rPr>
-          <w:t xml:space="preserve">25</w:t>
+          <w:t xml:space="preserve">33</w:t>
         </w:r>
         <w:r>
           <w:rPr>
@@ -3956,7 +3956,7 @@
             <w:rFonts w:ascii="Calibri" w:hAnsi="Calibri" w:cs="Calibri"/>
             <w:noProof/>
           </w:rPr>
-          <w:t xml:space="preserve">26</w:t>
+          <w:t xml:space="preserve">34</w:t>
         </w:r>
         <w:r>
           <w:rPr>
@@ -4019,7 +4019,7 @@
             <w:sz w:val="22"/>
             <w:szCs w:val="22"/>
           </w:rPr>
-          <w:t xml:space="preserve">26</w:t>
+          <w:t xml:space="preserve">34</w:t>
         </w:r>
         <w:r>
           <w:rPr>
@@ -4082,7 +4082,7 @@
             <w:sz w:val="22"/>
             <w:szCs w:val="22"/>
           </w:rPr>
-          <w:t xml:space="preserve">32</w:t>
+          <w:t xml:space="preserve">40</w:t>
         </w:r>
         <w:r>
           <w:rPr>
@@ -4142,7 +4142,7 @@
             <w:sz w:val="22"/>
             <w:szCs w:val="22"/>
           </w:rPr>
-          <w:t xml:space="preserve">33</w:t>
+          <w:t xml:space="preserve">41</w:t>
         </w:r>
         <w:r>
           <w:rPr>
@@ -4223,7 +4223,7 @@
           <w:rPr>
             <w:noProof/>
           </w:rPr>
-          <w:t xml:space="preserve">7</w:t>
+          <w:t xml:space="preserve">15</w:t>
         </w:r>
         <w:r>
           <w:rPr>
@@ -4280,7 +4280,7 @@
           <w:rPr>
             <w:noProof/>
           </w:rPr>
-          <w:t xml:space="preserve">8</w:t>
+          <w:t xml:space="preserve">16</w:t>
         </w:r>
         <w:r>
           <w:rPr>
@@ -4337,7 +4337,7 @@
           <w:rPr>
             <w:noProof/>
           </w:rPr>
-          <w:t xml:space="preserve">9</w:t>
+          <w:t xml:space="preserve">17</w:t>
         </w:r>
         <w:r>
           <w:rPr>
@@ -4394,7 +4394,7 @@
           <w:rPr>
             <w:noProof/>
           </w:rPr>
-          <w:t xml:space="preserve">10</w:t>
+          <w:t xml:space="preserve">18</w:t>
         </w:r>
         <w:r>
           <w:rPr>
@@ -4451,7 +4451,7 @@
           <w:rPr>
             <w:noProof/>
           </w:rPr>
-          <w:t xml:space="preserve">11</w:t>
+          <w:t xml:space="preserve">19</w:t>
         </w:r>
         <w:r>
           <w:rPr>
@@ -4508,7 +4508,7 @@
           <w:rPr>
             <w:noProof/>
           </w:rPr>
-          <w:t xml:space="preserve">19</w:t>
+          <w:t xml:space="preserve">27</w:t>
         </w:r>
         <w:r>
           <w:rPr>
@@ -4565,7 +4565,7 @@
           <w:rPr>
             <w:noProof/>
           </w:rPr>
-          <w:t xml:space="preserve">19</w:t>
+          <w:t xml:space="preserve">27</w:t>
         </w:r>
         <w:r>
           <w:rPr>
@@ -4622,7 +4622,7 @@
           <w:rPr>
             <w:noProof/>
           </w:rPr>
-          <w:t xml:space="preserve">20</w:t>
+          <w:t xml:space="preserve">28</w:t>
         </w:r>
         <w:r>
           <w:rPr>
@@ -4679,7 +4679,7 @@
           <w:rPr>
             <w:noProof/>
           </w:rPr>
-          <w:t xml:space="preserve">21</w:t>
+          <w:t xml:space="preserve">29</w:t>
         </w:r>
         <w:r>
           <w:rPr>
@@ -4736,7 +4736,7 @@
           <w:rPr>
             <w:noProof/>
           </w:rPr>
-          <w:t xml:space="preserve">26</w:t>
+          <w:t xml:space="preserve">34</w:t>
         </w:r>
         <w:r>
           <w:rPr>
@@ -4793,7 +4793,7 @@
           <w:rPr>
             <w:noProof/>
           </w:rPr>
-          <w:t xml:space="preserve">27</w:t>
+          <w:t xml:space="preserve">35</w:t>
         </w:r>
         <w:r>
           <w:rPr>
@@ -4850,7 +4850,7 @@
           <w:rPr>
             <w:noProof/>
           </w:rPr>
-          <w:t xml:space="preserve">27</w:t>
+          <w:t xml:space="preserve">35</w:t>
         </w:r>
         <w:r>
           <w:rPr>
@@ -4907,7 +4907,7 @@
           <w:rPr>
             <w:noProof/>
           </w:rPr>
-          <w:t xml:space="preserve">28</w:t>
+          <w:t xml:space="preserve">36</w:t>
         </w:r>
         <w:r>
           <w:rPr>
@@ -4964,7 +4964,7 @@
           <w:rPr>
             <w:noProof/>
           </w:rPr>
-          <w:t xml:space="preserve">29</w:t>
+          <w:t xml:space="preserve">37</w:t>
         </w:r>
         <w:r>
           <w:rPr>
@@ -5021,7 +5021,7 @@
           <w:rPr>
             <w:noProof/>
           </w:rPr>
-          <w:t xml:space="preserve">30</w:t>
+          <w:t xml:space="preserve">38</w:t>
         </w:r>
         <w:r>
           <w:rPr>
@@ -5078,7 +5078,7 @@
           <w:rPr>
             <w:noProof/>
           </w:rPr>
-          <w:t xml:space="preserve">30</w:t>
+          <w:t xml:space="preserve">38</w:t>
         </w:r>
         <w:r>
           <w:rPr>
@@ -5135,7 +5135,7 @@
           <w:rPr>
             <w:noProof/>
           </w:rPr>
-          <w:t xml:space="preserve">31</w:t>
+          <w:t xml:space="preserve">39</w:t>
         </w:r>
         <w:r>
           <w:rPr>
@@ -5189,7 +5189,7 @@
           <w:rPr>
             <w:noProof/>
           </w:rPr>
-          <w:t xml:space="preserve">32</w:t>
+          <w:t xml:space="preserve">40</w:t>
         </w:r>
         <w:r>
           <w:rPr>
@@ -5270,7 +5270,7 @@
           <w:rPr>
             <w:noProof/>
           </w:rPr>
-          <w:t xml:space="preserve">2</w:t>
+          <w:t xml:space="preserve">10</w:t>
         </w:r>
         <w:r>
           <w:rPr>
@@ -5327,7 +5327,7 @@
           <w:rPr>
             <w:noProof/>
           </w:rPr>
-          <w:t xml:space="preserve">3</w:t>
+          <w:t xml:space="preserve">11</w:t>
         </w:r>
         <w:r>
           <w:rPr>
@@ -5384,7 +5384,7 @@
           <w:rPr>
             <w:noProof/>
           </w:rPr>
-          <w:t xml:space="preserve">4</w:t>
+          <w:t xml:space="preserve">12</w:t>
         </w:r>
         <w:r>
           <w:rPr>
@@ -5441,7 +5441,7 @@
           <w:rPr>
             <w:noProof/>
           </w:rPr>
-          <w:t xml:space="preserve">4</w:t>
+          <w:t xml:space="preserve">12</w:t>
         </w:r>
         <w:r>
           <w:rPr>
@@ -5498,7 +5498,7 @@
           <w:rPr>
             <w:noProof/>
           </w:rPr>
-          <w:t xml:space="preserve">8</w:t>
+          <w:t xml:space="preserve">16</w:t>
         </w:r>
         <w:r>
           <w:rPr>
@@ -5555,7 +5555,7 @@
           <w:rPr>
             <w:noProof/>
           </w:rPr>
-          <w:t xml:space="preserve">9</w:t>
+          <w:t xml:space="preserve">17</w:t>
         </w:r>
         <w:r>
           <w:rPr>
@@ -5612,7 +5612,7 @@
           <w:rPr>
             <w:noProof/>
           </w:rPr>
-          <w:t xml:space="preserve">12</w:t>
+          <w:t xml:space="preserve">20</w:t>
         </w:r>
         <w:r>
           <w:rPr>
@@ -5669,7 +5669,7 @@
           <w:rPr>
             <w:noProof/>
           </w:rPr>
-          <w:t xml:space="preserve">12</w:t>
+          <w:t xml:space="preserve">20</w:t>
         </w:r>
         <w:r>
           <w:rPr>
@@ -5726,7 +5726,7 @@
           <w:rPr>
             <w:noProof/>
           </w:rPr>
-          <w:t xml:space="preserve">18</w:t>
+          <w:t xml:space="preserve">26</w:t>
         </w:r>
         <w:r>
           <w:rPr>
@@ -5783,7 +5783,7 @@
           <w:rPr>
             <w:noProof/>
           </w:rPr>
-          <w:t xml:space="preserve">20</w:t>
+          <w:t xml:space="preserve">28</w:t>
         </w:r>
         <w:r>
           <w:rPr>
@@ -5840,7 +5840,7 @@
           <w:rPr>
             <w:noProof/>
           </w:rPr>
-          <w:t xml:space="preserve">22</w:t>
+          <w:t xml:space="preserve">30</w:t>
         </w:r>
         <w:r>
           <w:rPr>
@@ -5897,7 +5897,7 @@
           <w:rPr>
             <w:noProof/>
           </w:rPr>
-          <w:t xml:space="preserve">22</w:t>
+          <w:t xml:space="preserve">30</w:t>
         </w:r>
         <w:r>
           <w:rPr>
@@ -5954,7 +5954,7 @@
           <w:rPr>
             <w:noProof/>
           </w:rPr>
-          <w:t xml:space="preserve">23</w:t>
+          <w:t xml:space="preserve">31</w:t>
         </w:r>
         <w:r>
           <w:rPr>
@@ -6011,7 +6011,7 @@
           <w:rPr>
             <w:noProof/>
           </w:rPr>
-          <w:t xml:space="preserve">32</w:t>
+          <w:t xml:space="preserve">40</w:t>
         </w:r>
         <w:r>
           <w:rPr>
@@ -6065,7 +6065,7 @@
           <w:rPr>
             <w:noProof/>
           </w:rPr>
-          <w:t xml:space="preserve">33</w:t>
+          <w:t xml:space="preserve">41</w:t>
         </w:r>
         <w:r>
           <w:rPr>
@@ -6090,7 +6090,7 @@
             <w:bottom w:val="single" w:sz="6" w:space="24" w:color="auto"/>
             <w:right w:val="single" w:sz="6" w:space="24" w:color="auto"/>
           </w:pgBorders>
-          <w:pgNumType w:fmt="lowerRoman" w:start="1"/>
+          <w:pgNumType w:fmt="decimal" w:start="1"/>
           <w:cols w:space="708"/>
           <w:bidi/>
           <w:rtlGutter/>
@@ -21721,7 +21721,7 @@
         <w:bottom w:val="single" w:sz="6" w:space="24" w:color="auto"/>
         <w:right w:val="single" w:sz="6" w:space="24" w:color="auto"/>
       </w:pgBorders>
-      <w:pgNumType w:start="1"/>
+      <w:pgNumType w:fmt="decimal"/>
       <w:cols w:space="708"/>
       <w:bidi/>
       <w:rtlGutter/>
@@ -21763,21 +21763,63 @@
       <w:jc w:val="center"/>
     </w:pPr>
     <w:r>
+      <w:rPr>
+        <w:rFonts w:ascii="Times New Roman" w:hAnsi="Times New Roman" w:cs="Times New Roman"/>
+        <w:b/>
+        <w:bCs/>
+        <w:color w:val="000000"/>
+        <w:sz w:val="28"/>
+        <w:szCs w:val="28"/>
+        <w:lang w:val="en-US" w:bidi="ar-MA"/>
+      </w:rPr>
       <w:fldChar w:fldCharType="begin"/>
     </w:r>
     <w:r>
+      <w:rPr>
+        <w:rFonts w:ascii="Times New Roman" w:hAnsi="Times New Roman" w:cs="Times New Roman"/>
+        <w:b/>
+        <w:bCs/>
+        <w:color w:val="000000"/>
+        <w:sz w:val="28"/>
+        <w:szCs w:val="28"/>
+        <w:lang w:val="en-US" w:bidi="ar-MA"/>
+      </w:rPr>
       <w:instrText xml:space="preserve"> PAGE </w:instrText>
     </w:r>
     <w:r>
+      <w:rPr>
+        <w:rFonts w:ascii="Times New Roman" w:hAnsi="Times New Roman" w:cs="Times New Roman"/>
+        <w:b/>
+        <w:bCs/>
+        <w:color w:val="000000"/>
+        <w:sz w:val="28"/>
+        <w:szCs w:val="28"/>
+        <w:lang w:val="en-US" w:bidi="ar-MA"/>
+      </w:rPr>
       <w:fldChar w:fldCharType="separate"/>
     </w:r>
     <w:r>
       <w:rPr>
-        <w:noProof/>
+        <w:rFonts w:ascii="Times New Roman" w:hAnsi="Times New Roman" w:cs="Times New Roman"/>
+        <w:b/>
+        <w:bCs/>
+        <w:color w:val="000000"/>
+        <w:sz w:val="28"/>
+        <w:szCs w:val="28"/>
+        <w:lang w:val="en-US" w:bidi="ar-MA"/>
       </w:rPr>
-      <w:t>ii</w:t>
+      <w:t>1</w:t>
     </w:r>
     <w:r>
+      <w:rPr>
+        <w:rFonts w:ascii="Times New Roman" w:hAnsi="Times New Roman" w:cs="Times New Roman"/>
+        <w:b/>
+        <w:bCs/>
+        <w:color w:val="000000"/>
+        <w:sz w:val="28"/>
+        <w:szCs w:val="28"/>
+        <w:lang w:val="en-US" w:bidi="ar-MA"/>
+      </w:rPr>
       <w:fldChar w:fldCharType="end"/>
     </w:r>
   </w:p>
@@ -21791,22 +21833,63 @@
       <w:jc w:val="center"/>
     </w:pPr>
     <w:r>
+      <w:rPr>
+        <w:rFonts w:ascii="Times New Roman" w:hAnsi="Times New Roman" w:cs="Times New Roman"/>
+        <w:b/>
+        <w:bCs/>
+        <w:color w:val="000000"/>
+        <w:sz w:val="28"/>
+        <w:szCs w:val="28"/>
+        <w:lang w:val="en-US" w:bidi="ar-MA"/>
+      </w:rPr>
       <w:fldChar w:fldCharType="begin"/>
     </w:r>
     <w:r>
+      <w:rPr>
+        <w:rFonts w:ascii="Times New Roman" w:hAnsi="Times New Roman" w:cs="Times New Roman"/>
+        <w:b/>
+        <w:bCs/>
+        <w:color w:val="000000"/>
+        <w:sz w:val="28"/>
+        <w:szCs w:val="28"/>
+        <w:lang w:val="en-US" w:bidi="ar-MA"/>
+      </w:rPr>
       <w:instrText xml:space="preserve"> PAGE </w:instrText>
     </w:r>
     <w:r>
+      <w:rPr>
+        <w:rFonts w:ascii="Times New Roman" w:hAnsi="Times New Roman" w:cs="Times New Roman"/>
+        <w:b/>
+        <w:bCs/>
+        <w:color w:val="000000"/>
+        <w:sz w:val="28"/>
+        <w:szCs w:val="28"/>
+        <w:lang w:val="en-US" w:bidi="ar-MA"/>
+      </w:rPr>
       <w:fldChar w:fldCharType="separate"/>
     </w:r>
     <w:r>
       <w:rPr>
-        <w:noProof/>
-        <w:rtl/>
+        <w:rFonts w:ascii="Times New Roman" w:hAnsi="Times New Roman" w:cs="Times New Roman"/>
+        <w:b/>
+        <w:bCs/>
+        <w:color w:val="000000"/>
+        <w:sz w:val="28"/>
+        <w:szCs w:val="28"/>
+        <w:lang w:val="en-US" w:bidi="ar-MA"/>
       </w:rPr>
       <w:t>1</w:t>
     </w:r>
     <w:r>
+      <w:rPr>
+        <w:rFonts w:ascii="Times New Roman" w:hAnsi="Times New Roman" w:cs="Times New Roman"/>
+        <w:b/>
+        <w:bCs/>
+        <w:color w:val="000000"/>
+        <w:sz w:val="28"/>
+        <w:szCs w:val="28"/>
+        <w:lang w:val="en-US" w:bidi="ar-MA"/>
+      </w:rPr>
       <w:fldChar w:fldCharType="end"/>
     </w:r>
   </w:p>
@@ -22227,7 +22310,7 @@
         <w:rFonts w:asciiTheme="minorHAnsi" w:eastAsiaTheme="minorHAnsi" w:hAnsiTheme="minorHAnsi" w:cstheme="minorBidi"/>
         <w:sz w:val="22"/>
         <w:szCs w:val="22"/>
-        <w:lang w:val="en-US" w:eastAsia="en-US" w:bidi="ar-SA"/>
+        <w:lang w:val="en-US" w:eastAsia="en-US" w:bidi="ar-MA"/>
       </w:rPr>
     </w:rPrDefault>
     <w:pPrDefault>

</xml_diff>

<commit_message>
Add site QR code to the report cover and the login page
Co-Authored-By: Claude Opus 5.5 <noreply@anthropic.com>
Claude-Session: https://claude.ai/code/session_01RVHqZkty1Aftyae7eJBKDt
</commit_message>
<xml_diff>
--- a/docs/report/graduation-report-final.docx
+++ b/docs/report/graduation-report-final.docx
@@ -212,8 +212,6 @@
     <w:p/>
     <w:p/>
     <w:p/>
-    <w:p/>
-    <w:p/>
     <w:p>
       <w:pPr>
         <w:rPr>
@@ -940,6 +938,68 @@
           <w:rtl/>
         </w:rPr>
         <w:t xml:space="preserve"> /2026]</w:t>
+      </w:r>
+    </w:p>
+    <w:p>
+      <w:pPr>
+        <w:spacing w:before="160" w:after="0"/>
+        <w:jc w:val="center"/>
+      </w:pPr>
+      <w:r>
+        <w:rPr>
+          <w:noProof/>
+        </w:rPr>
+        <w:drawing>
+          <wp:inline distT="0" distB="0" distL="0" distR="0">
+            <wp:extent cx="900000" cy="900000"/>
+            <wp:effectExtent l="0" t="0" r="0" b="0"/>
+            <wp:docPr id="29" name="QR" descr="رمز QR لرابط المنصة"/>
+            <wp:cNvGraphicFramePr>
+              <a:graphicFrameLocks xmlns:a="http://schemas.openxmlformats.org/drawingml/2006/main" noChangeAspect="1"/>
+            </wp:cNvGraphicFramePr>
+            <a:graphic xmlns:a="http://schemas.openxmlformats.org/drawingml/2006/main">
+              <a:graphicData uri="http://schemas.openxmlformats.org/drawingml/2006/picture">
+                <pic:pic xmlns:pic="http://schemas.openxmlformats.org/drawingml/2006/picture">
+                  <pic:nvPicPr>
+                    <pic:cNvPr id="29" name="qr-site.png"/>
+                    <pic:cNvPicPr/>
+                  </pic:nvPicPr>
+                  <pic:blipFill>
+                    <a:blip r:embed="rIdQR1"/>
+                    <a:stretch>
+                      <a:fillRect/>
+                    </a:stretch>
+                  </pic:blipFill>
+                  <pic:spPr>
+                    <a:xfrm>
+                      <a:off x="0" y="0"/>
+                      <a:ext cx="900000" cy="900000"/>
+                    </a:xfrm>
+                    <a:prstGeom prst="rect">
+                      <a:avLst/>
+                    </a:prstGeom>
+                  </pic:spPr>
+                </pic:pic>
+              </a:graphicData>
+            </a:graphic>
+          </wp:inline>
+        </w:drawing>
+      </w:r>
+    </w:p>
+    <w:p>
+      <w:pPr>
+        <w:bidi/>
+        <w:spacing w:after="0"/>
+        <w:jc w:val="center"/>
+      </w:pPr>
+      <w:r>
+        <w:rPr>
+          <w:rFonts w:ascii="Times New Roman" w:hAnsi="Times New Roman" w:cs="Times New Roman"/>
+          <w:sz w:val="18"/>
+          <w:szCs w:val="18"/>
+          <w:rtl/>
+        </w:rPr>
+        <w:t>امسح الرمز لتجربة المنصة</w:t>
       </w:r>
     </w:p>
     <w:p>

</xml_diff>